<commit_message>
Milestone 6 memo: verdict stated per module, peer screen sourced to the Milestone 5 memo, unit error sourced to its commit, tax-rate catch dated correctly; Module 7 prompt fixes from the template
Co-Authored-By: Claude Opus 5.5 <noreply@anthropic.com>
</commit_message>
<xml_diff>
--- a/research/03 Drafts/Milestone 6 - AI Use Evaluation Memo.docx
+++ b/research/03 Drafts/Milestone 6 - AI Use Evaluation Memo.docx
@@ -677,7 +677,7 @@
           <w:color w:val="000000"/>
           <w:sz w:val="24"/>
         </w:rPr>
-        <w:t xml:space="preserve">Module 1, the Thesis facts.</w:t>
+        <w:t xml:space="preserve">Module 1, the Thesis facts. Verdict: mixed.</w:t>
       </w:r>
       <w:r>
         <w:rPr>
@@ -742,7 +742,7 @@
           <w:color w:val="000000"/>
           <w:sz w:val="24"/>
         </w:rPr>
-        <w:t xml:space="preserve">Module 2, the data pull.</w:t>
+        <w:t xml:space="preserve">Module 2, the data pull. Verdict: held up, with three failures around it.</w:t>
       </w:r>
       <w:r>
         <w:rPr>
@@ -758,7 +758,7 @@
           <w:color w:val="000000"/>
           <w:sz w:val="24"/>
         </w:rPr>
-        <w:t xml:space="preserve">This held up. Our script, run by Claude, filled 32 cells from the SEC’s XBRL data, and a line-by-line comparison with the FY2025 Form 10-K found 38 of 38 filing-based figures correct (pages 53, 55, 56, and 97) [S1, S24]. Three things went wrong around it:</w:t>
+        <w:t xml:space="preserve">The pull itself held up. Our script, run by Claude, filled 32 cells from the SEC’s XBRL data, and a line-by-line comparison with the FY2025 Form 10-K found 38 of 38 filing-based figures correct (pages 53, 55, 56, and 97) [S1, S24]. Three things went wrong around it:</w:t>
       </w:r>
       <w:r>
         <w:rPr>
@@ -858,7 +858,7 @@
           <w:color w:val="000000"/>
           <w:sz w:val="24"/>
         </w:rPr>
-        <w:t xml:space="preserve">Our converter computed the tax rate as taxes over net income, 37.5 percent, instead of taxes over pre-tax income, 27.3 percent. Nothing flagged it. Claude caught it in the next module’s kickoff by recomputing the rate from the workbook.</w:t>
+        <w:t xml:space="preserve">Our converter computed the tax rate as taxes over net income, 37.5 percent, instead of taxes over pre-tax income, 27.3 percent. Nothing flagged it. Claude caught it the next time it ran the converter, the same day, by recomputing the rate from the workbook values [S24].</w:t>
       </w:r>
       <w:r>
         <w:rPr>
@@ -923,7 +923,7 @@
           <w:color w:val="000000"/>
           <w:sz w:val="24"/>
         </w:rPr>
-        <w:t xml:space="preserve">Module 3, the input check.</w:t>
+        <w:t xml:space="preserve">Module 3, the input check. Verdict: held up.</w:t>
       </w:r>
       <w:r>
         <w:rPr>
@@ -939,7 +939,7 @@
           <w:color w:val="000000"/>
           <w:sz w:val="24"/>
         </w:rPr>
-        <w:t xml:space="preserve">This held up and added real value. Asked to list every WACC input and its tier, Claude found five inputs the memo had not tagged (the industry beta, the industry debt-to-equity and tax rate, the unlevered beta, and Hershey’s debt-to-equity). We confirmed each by reading the WACC tab directly.</w:t>
+        <w:t xml:space="preserve">It added real value. Asked to list every WACC input and its tier, Claude found five inputs the memo had not tagged (the industry beta, the industry debt-to-equity and tax rate, the unlevered beta, and Hershey’s debt-to-equity). We confirmed each by reading the WACC tab directly.</w:t>
       </w:r>
     </w:p>
     <w:p>
@@ -954,7 +954,7 @@
           <w:color w:val="000000"/>
           <w:sz w:val="24"/>
         </w:rPr>
-        <w:t xml:space="preserve">Module 4, the sensitivity build.</w:t>
+        <w:t xml:space="preserve">Module 4, the sensitivity build. Verdict: held up.</w:t>
       </w:r>
       <w:r>
         <w:rPr>
@@ -970,7 +970,7 @@
           <w:color w:val="000000"/>
           <w:sz w:val="24"/>
         </w:rPr>
-        <w:t xml:space="preserve">This held up on the arithmetic. The engine gives $218.59 and $193.02 at the workbook’s inputs, and all 50 sensitivity cells match the DCF tab within a cent. Two things to note:</w:t>
+        <w:t xml:space="preserve">The arithmetic held. The engine gives $218.59 and $193.02 at the workbook’s inputs, and all 50 sensitivity cells match the DCF tab within a cent. Two things to note:</w:t>
       </w:r>
       <w:r>
         <w:rPr>
@@ -1020,7 +1020,7 @@
           <w:color w:val="000000"/>
           <w:sz w:val="24"/>
         </w:rPr>
-        <w:t xml:space="preserve">While we built the converter, it trusted the DCF tab’s units note, which says thousands, and divided every DCF figure by a thousand, although the figures are in millions. Nothing warned us; we caught it by comparing the converter’s revenue with the Detail Data tab, and the converter now makes that comparison itself.</w:t>
+        <w:t xml:space="preserve">While we built the converter, it trusted the DCF tab’s units note, which says thousands, and divided every DCF figure by a thousand, although the figures are in millions. Nothing warned us; we caught it by comparing the converter’s revenue with the Detail Data tab, and the converter now makes that comparison itself (template commit 98f7e18). This happened while we prepared the converter, outside a logged session, so it has no row in our AI Log; we have added that to our recommendations.</w:t>
       </w:r>
       <w:r>
         <w:rPr>
@@ -1117,7 +1117,7 @@
           <w:color w:val="000000"/>
           <w:sz w:val="24"/>
         </w:rPr>
-        <w:t xml:space="preserve">Module 5, the peer screen.</w:t>
+        <w:t xml:space="preserve">Module 5, the peer screen. Verdict: mixed.</w:t>
       </w:r>
       <w:r>
         <w:rPr>
@@ -1167,7 +1167,7 @@
           <w:color w:val="000000"/>
           <w:sz w:val="24"/>
         </w:rPr>
-        <w:t xml:space="preserve">It matched on industry label, not on what a multiple needs. We kept Mondelez, Lindt, and Tootsie Roll. The build that followed was exact: the weighted values match our memo to the cent.</w:t>
+        <w:t xml:space="preserve">It matched on industry label, not on what a multiple needs. We kept Mondelez, Lindt, and Tootsie Roll; the proposal and our reasons are in our Milestone 5 memo, section 2 [S25]. The build that followed was exact: the weighted values match our memo to the cent.</w:t>
       </w:r>
     </w:p>
     <w:p>
@@ -1182,7 +1182,7 @@
           <w:color w:val="000000"/>
           <w:sz w:val="24"/>
         </w:rPr>
-        <w:t xml:space="preserve">Module 6, the research run.</w:t>
+        <w:t xml:space="preserve">Module 6, the research run. Verdict: mixed.</w:t>
       </w:r>
       <w:r>
         <w:rPr>
@@ -1423,7 +1423,7 @@
           <w:color w:val="000000"/>
           <w:sz w:val="24"/>
         </w:rPr>
-        <w:t xml:space="preserve">Commit files by name, never all at once.</w:t>
+        <w:t xml:space="preserve">Commit files by name, never all at once, and log every AI session.</w:t>
       </w:r>
       <w:r>
         <w:rPr>
@@ -1439,7 +1439,7 @@
           <w:color w:val="000000"/>
           <w:sz w:val="24"/>
         </w:rPr>
-        <w:t xml:space="preserve">Licensed data stays outside the repository. This follows from Module 2.</w:t>
+        <w:t xml:space="preserve">Licensed data stays outside the repository, and work done outside a logged session gets a row the same day. This follows from Module 2 and the unlogged unit error in Module 4.</w:t>
       </w:r>
     </w:p>
     <w:bookmarkEnd w:id="12"/>
@@ -1938,7 +1938,7 @@
                 <w:color w:val="000000"/>
                 <w:sz w:val="22"/>
               </w:rPr>
-              <w:t xml:space="preserve">S24</w:t>
+              <w:t xml:space="preserve">S25</w:t>
             </w:r>
           </w:p>
         </w:tc>
@@ -2440,6 +2440,88 @@
                 <w:sz w:val="22"/>
               </w:rPr>
               <w:t xml:space="preserve">AI Log.md (this repository)</w:t>
+            </w:r>
+          </w:p>
+        </w:tc>
+      </w:tr>
+      <w:tr>
+        <w:tc>
+          <w:tcPr/>
+          <w:p>
+            <w:pPr>
+              <w:pStyle w:val="Compact"/>
+            </w:pPr>
+            <w:r>
+              <w:rPr>
+                <w:rFonts w:ascii="Aptos" w:hAnsi="Aptos" w:cs="Aptos" w:eastAsia="Aptos"/>
+                <w:color w:val="000000"/>
+                <w:sz w:val="22"/>
+              </w:rPr>
+              <w:t xml:space="preserve">S25</w:t>
+            </w:r>
+          </w:p>
+        </w:tc>
+        <w:tc>
+          <w:tcPr/>
+          <w:p>
+            <w:pPr>
+              <w:pStyle w:val="Compact"/>
+            </w:pPr>
+            <w:r>
+              <w:rPr>
+                <w:rFonts w:ascii="Aptos" w:hAnsi="Aptos" w:cs="Aptos" w:eastAsia="Aptos"/>
+                <w:color w:val="000000"/>
+                <w:sz w:val="22"/>
+              </w:rPr>
+              <w:t xml:space="preserve">Team Milestone 5 Relative Valuation and Reconciliation Memo</w:t>
+            </w:r>
+          </w:p>
+        </w:tc>
+        <w:tc>
+          <w:tcPr/>
+          <w:p>
+            <w:pPr>
+              <w:pStyle w:val="Compact"/>
+            </w:pPr>
+            <w:r>
+              <w:rPr>
+                <w:rFonts w:ascii="Aptos" w:hAnsi="Aptos" w:cs="Aptos" w:eastAsia="Aptos"/>
+                <w:color w:val="000000"/>
+                <w:sz w:val="22"/>
+              </w:rPr>
+              <w:t xml:space="preserve">FIN 5370 HSY team</w:t>
+            </w:r>
+          </w:p>
+        </w:tc>
+        <w:tc>
+          <w:tcPr/>
+          <w:p>
+            <w:pPr>
+              <w:pStyle w:val="Compact"/>
+            </w:pPr>
+            <w:r>
+              <w:rPr>
+                <w:rFonts w:ascii="Aptos" w:hAnsi="Aptos" w:cs="Aptos" w:eastAsia="Aptos"/>
+                <w:color w:val="000000"/>
+                <w:sz w:val="22"/>
+              </w:rPr>
+              <w:t xml:space="preserve">2026-10-07</w:t>
+            </w:r>
+          </w:p>
+        </w:tc>
+        <w:tc>
+          <w:tcPr/>
+          <w:p>
+            <w:pPr>
+              <w:pStyle w:val="Compact"/>
+            </w:pPr>
+            <w:r>
+              <w:rPr>
+                <w:rFonts w:ascii="Aptos" w:hAnsi="Aptos" w:cs="Aptos" w:eastAsia="Aptos"/>
+                <w:color w:val="000000"/>
+                <w:sz w:val="22"/>
+              </w:rPr>
+              <w:t xml:space="preserve">research/03 Drafts/Milestone 5 - Relative Valuation and Reconciliation Memo.md</w:t>
             </w:r>
           </w:p>
         </w:tc>

</xml_diff>

<commit_message>
Milestone 6 memo: recommendations are for the final presentation (no Module 8); unit-error evidence is the converter's scale check in this repo; page-reader limit sourced to the research report
Co-Authored-By: Claude Opus 5.5 <noreply@anthropic.com>
</commit_message>
<xml_diff>
--- a/research/03 Drafts/Milestone 6 - AI Use Evaluation Memo.docx
+++ b/research/03 Drafts/Milestone 6 - AI Use Evaluation Memo.docx
@@ -146,7 +146,7 @@
           <w:color w:val="000000"/>
           <w:sz w:val="24"/>
         </w:rPr>
-        <w:t xml:space="preserve">Across Modules 1 to 6 we logged 45 AI-assisted tasks: 43 helped, 1 misled, and 1 did not help [S24]. Claude was most useful where its work could be checked against a fixed source: it filled 32 workbook cells from SEC filings that a line-by-line check found 38 of 38 correct, and it rebuilt our DCF to within a cent of the workbook in all 50 sensitivity cells. It was least reliable where its output only looked checked. Seven of the 31 facts it filed in Module 1 cite a page that does not show the figure, and three times a number came out wrong without any warning: a tax rate, a unit scale, and a commit that swept a licensed file into our public repository. Our main change for Module 8: no figure goes on the site until a person has confirmed its note.</w:t>
+        <w:t xml:space="preserve">Across Modules 1 to 6 we logged 45 AI-assisted tasks: 43 helped, 1 misled, and 1 did not help [S24]. Claude was most useful where its work could be checked against a fixed source: it filled 32 workbook cells from SEC filings that a line-by-line check found 38 of 38 correct, and it rebuilt our DCF to within a cent of the workbook in all 50 sensitivity cells. It was least reliable where its output only looked checked. Seven of the 31 facts it filed in Module 1 cite a page that does not show the figure, and three times a number came out wrong without any warning: a tax rate, a unit scale, and a commit that swept a licensed file into our public repository. Our main change before we present: no figure goes on the site until a person has confirmed its note.</w:t>
       </w:r>
     </w:p>
     <w:bookmarkStart w:id="9" w:name="X28124725638838dc33a7767018a08bc34f44e19"/>
@@ -1020,7 +1020,7 @@
           <w:color w:val="000000"/>
           <w:sz w:val="24"/>
         </w:rPr>
-        <w:t xml:space="preserve">While we built the converter, it trusted the DCF tab’s units note, which says thousands, and divided every DCF figure by a thousand, although the figures are in millions. Nothing warned us; we caught it by comparing the converter’s revenue with the Detail Data tab, and the converter now makes that comparison itself (template commit 98f7e18). This happened while we prepared the converter, outside a logged session, so it has no row in our AI Log; we have added that to our recommendations.</w:t>
+        <w:t xml:space="preserve">While we built the converter, it trusted the DCF tab’s units note, which says thousands, and divided every DCF figure by a thousand, although the figures are in millions. Nothing warned us; we caught it by comparing the converter’s revenue with the Detail Data tab, and the converter now makes that comparison itself (scripts/workbook_to_data.py, the scale check at the top of read_dcf). This happened while we prepared the converter, outside a logged session, so it has no row in our AI Log; we have added that to our recommendations.</w:t>
       </w:r>
       <w:r>
         <w:rPr>
@@ -1232,7 +1232,7 @@
           <w:color w:val="000000"/>
           <w:sz w:val="24"/>
         </w:rPr>
-        <w:t xml:space="preserve">The page reader returned quotes of about 125 characters, so long sentences arrived in fragments, and it dropped the column headings of the ICCO price table, so that figure is tier partial until we read the page ourselves. All 39 notes from the run are still needs-verification.</w:t>
+        <w:t xml:space="preserve">The page reader returned quotes of about 125 characters, as our research report records [S26], so long sentences arrived in fragments, and it dropped the column headings of the ICCO price table, so that figure is tier partial until we read the page ourselves. All 39 notes from the run are still needs-verification.</w:t>
       </w:r>
     </w:p>
     <w:bookmarkEnd w:id="10"/>
@@ -1288,7 +1288,7 @@
       </w:r>
     </w:p>
     <w:bookmarkEnd w:id="11"/>
-    <w:bookmarkStart w:id="12" w:name="what-we-will-change-for-module-8"/>
+    <w:bookmarkStart w:id="12" w:name="what-we-will-change-before-we-present"/>
     <w:p>
       <w:pPr>
         <w:pStyle w:val="Heading2"/>
@@ -1299,7 +1299,7 @@
           <w:color w:val="000000"/>
           <w:sz w:val="28"/>
         </w:rPr>
-        <w:t xml:space="preserve">4. What we will change for Module 8</w:t>
+        <w:t xml:space="preserve">4. What we will change before we present</w:t>
       </w:r>
     </w:p>
     <w:p>
@@ -2440,6 +2440,88 @@
                 <w:sz w:val="22"/>
               </w:rPr>
               <w:t xml:space="preserve">AI Log.md (this repository)</w:t>
+            </w:r>
+          </w:p>
+        </w:tc>
+      </w:tr>
+      <w:tr>
+        <w:tc>
+          <w:tcPr/>
+          <w:p>
+            <w:pPr>
+              <w:pStyle w:val="Compact"/>
+            </w:pPr>
+            <w:r>
+              <w:rPr>
+                <w:rFonts w:ascii="Aptos" w:hAnsi="Aptos" w:cs="Aptos" w:eastAsia="Aptos"/>
+                <w:color w:val="000000"/>
+                <w:sz w:val="22"/>
+              </w:rPr>
+              <w:t xml:space="preserve">S26</w:t>
+            </w:r>
+          </w:p>
+        </w:tc>
+        <w:tc>
+          <w:tcPr/>
+          <w:p>
+            <w:pPr>
+              <w:pStyle w:val="Compact"/>
+            </w:pPr>
+            <w:r>
+              <w:rPr>
+                <w:rFonts w:ascii="Aptos" w:hAnsi="Aptos" w:cs="Aptos" w:eastAsia="Aptos"/>
+                <w:color w:val="000000"/>
+                <w:sz w:val="22"/>
+              </w:rPr>
+              <w:t xml:space="preserve">Team Module 6 research report</w:t>
+            </w:r>
+          </w:p>
+        </w:tc>
+        <w:tc>
+          <w:tcPr/>
+          <w:p>
+            <w:pPr>
+              <w:pStyle w:val="Compact"/>
+            </w:pPr>
+            <w:r>
+              <w:rPr>
+                <w:rFonts w:ascii="Aptos" w:hAnsi="Aptos" w:cs="Aptos" w:eastAsia="Aptos"/>
+                <w:color w:val="000000"/>
+                <w:sz w:val="22"/>
+              </w:rPr>
+              <w:t xml:space="preserve">FIN 5370 HSY team</w:t>
+            </w:r>
+          </w:p>
+        </w:tc>
+        <w:tc>
+          <w:tcPr/>
+          <w:p>
+            <w:pPr>
+              <w:pStyle w:val="Compact"/>
+            </w:pPr>
+            <w:r>
+              <w:rPr>
+                <w:rFonts w:ascii="Aptos" w:hAnsi="Aptos" w:cs="Aptos" w:eastAsia="Aptos"/>
+                <w:color w:val="000000"/>
+                <w:sz w:val="22"/>
+              </w:rPr>
+              <w:t xml:space="preserve">2026-10-09</w:t>
+            </w:r>
+          </w:p>
+        </w:tc>
+        <w:tc>
+          <w:tcPr/>
+          <w:p>
+            <w:pPr>
+              <w:pStyle w:val="Compact"/>
+            </w:pPr>
+            <w:r>
+              <w:rPr>
+                <w:rFonts w:ascii="Aptos" w:hAnsi="Aptos" w:cs="Aptos" w:eastAsia="Aptos"/>
+                <w:color w:val="000000"/>
+                <w:sz w:val="22"/>
+              </w:rPr>
+              <w:t xml:space="preserve">research/03 Drafts/Module 6 - Research report.md</w:t>
             </w:r>
           </w:p>
         </w:tc>

</xml_diff>